<commit_message>
docs(m2): record approved concept scope and final archive review
</commit_message>
<xml_diff>
--- a/reports/M2_report.docx
+++ b/reports/M2_report.docx
@@ -36,7 +36,7 @@
         <w:rPr>
           <w:rFonts w:hint="eastAsia"/>
         </w:rPr>
-        <w:t xml:space="preserve">未经样机温度标定</w:t>
+        <w:t xml:space="preserve">概念范围验收通过</w:t>
       </w:r>
       <w:r>
         <w:t xml:space="preserve"> · </w:t>
@@ -45,7 +45,7 @@
         <w:rPr>
           <w:rFonts w:hint="eastAsia"/>
         </w:rPr>
-        <w:t xml:space="preserve">阶段待验收</w:t>
+        <w:t xml:space="preserve">未经样机温度标定</w:t>
       </w:r>
     </w:p>
     <w:p>
@@ -218,28 +218,21 @@
         <w:rPr>
           <w:rFonts w:hint="eastAsia"/>
         </w:rPr>
-        <w:t xml:space="preserve">，后续图稿布局修改与结果SHA在独立检查及阶段登记中记录。当前</w:t>
+        <w:t xml:space="preserve">。2026-10-20研究者按“具有明确工程假设、通过能量守恒及数值验证的概念瞬态热网络模型”范围验收，批准</w:t>
       </w:r>
       <w:hyperlink r:id="rId18">
         <w:r>
           <w:rPr>
             <w:rStyle w:val="Hyperlink"/>
-            <w:rFonts w:hint="eastAsia"/>
           </w:rPr>
-          <w:t xml:space="preserve">草稿PR</w:t>
-        </w:r>
-        <w:r>
-          <w:rPr>
-            <w:rStyle w:val="Hyperlink"/>
-          </w:rPr>
-          <w:t xml:space="preserve"> #3</w:t>
+          <w:t xml:space="preserve">PR #3</w:t>
         </w:r>
       </w:hyperlink>
       <w:r>
         <w:rPr>
           <w:rFonts w:hint="eastAsia"/>
         </w:rPr>
-        <w:t xml:space="preserve">待研究者验收，未合并、未创建M2-v1.0、未进入M3。</w:t>
+        <w:t xml:space="preserve">合并与正式归档；实际合并SHA及Tag核验在阶段登记中追加。</w:t>
       </w:r>
     </w:p>
     <w:p>
@@ -7180,7 +7173,7 @@
         <w:rPr>
           <w:rFonts w:hint="eastAsia"/>
         </w:rPr>
-        <w:t xml:space="preserve">M2当前为待验收概念预测；PR</w:t>
+        <w:t xml:space="preserve">M2已获上述限定概念范围批准；真实几何、热阻、换热和温度标定尚未完成。只有M2-v1.0远端归档核验成功后才获准开展M3几何；M4</w:t>
       </w:r>
       <w:r>
         <w:t xml:space="preserve"> </w:t>
@@ -7189,16 +7182,7 @@
         <w:rPr>
           <w:rFonts w:hint="eastAsia"/>
         </w:rPr>
-        <w:t xml:space="preserve">#3保持草稿，M2-v1.0未创建。未经研究者批准，不合并、不启动M3</w:t>
-      </w:r>
-      <w:r>
-        <w:t xml:space="preserve"> </w:t>
-      </w:r>
-      <w:r>
-        <w:rPr>
-          <w:rFonts w:hint="eastAsia"/>
-        </w:rPr>
-        <w:t xml:space="preserve">CAD、ANSYS或Fluent。</w:t>
+        <w:t xml:space="preserve">ANSYS及Fluent未执行，须另行批准。</w:t>
       </w:r>
     </w:p>
     <w:bookmarkEnd w:id="52"/>

</xml_diff>